<commit_message>
refactor: simplify query results and complete lab 1 MVC diagrams
</commit_message>
<xml_diff>
--- a/docs/course/lab1/report.docx
+++ b/docs/course/lab1/report.docx
@@ -2787,7 +2787,7 @@
       <w:r>
         <w:drawing>
           <wp:inline distT="0" distB="0" distL="0" distR="0">
-            <wp:extent cx="5760000" cy="5097600"/>
+            <wp:extent cx="5760000" cy="3682623"/>
             <wp:docPr id="30" name="Рис. 1. Системная диаграмма последовательности Главного меню" descr="Рис. 1. Системная диаграмма последовательности Главного меню"/>
             <wp:cNvGraphicFramePr>
               <a:graphicFrameLocks noChangeAspect="1"/>
@@ -2808,7 +2808,7 @@
                   <pic:spPr>
                     <a:xfrm>
                       <a:off x="0" y="0"/>
-                      <a:ext cx="5760000" cy="5097600"/>
+                      <a:ext cx="5760000" cy="3682623"/>
                     </a:xfrm>
                     <a:prstGeom prst="rect">
                       <a:avLst/>
@@ -2848,7 +2848,7 @@
           <w:szCs w:val="28"/>
           <w:lang w:val="ru-RU"/>
         </w:rPr>
-        <w:t xml:space="preserve">Диаграмма показывает взаимодействие пользователя с системой как с единым объектом. После отображения главного меню выполняется одна из двух альтернатив: переход к запросам или завершение работы.</w:t>
+        <w:t xml:space="preserve">Диаграмма построена по схеме MVC: пользователь, представление (V), контроллер (C) и модель (M). Главное меню использует обработчики main_menu и exit_func и соответствующие HTML-шаблоны; обращений к модели на этом шаге нет.</w:t>
       </w:r>
     </w:p>
     <w:p>
@@ -3401,7 +3401,7 @@
           <w:szCs w:val="32"/>
           <w:lang w:val="ru-RU"/>
         </w:rPr>
-        <w:t xml:space="preserve">2.2. Системная диаграмма меню запросов</w:t>
+        <w:t xml:space="preserve">2.2. Системная диаграмма работы с запросами</w:t>
       </w:r>
     </w:p>
     <w:p>
@@ -3413,8 +3413,8 @@
       <w:r>
         <w:drawing>
           <wp:inline distT="0" distB="0" distL="0" distR="0">
-            <wp:extent cx="5400000" cy="5076000"/>
-            <wp:docPr id="31" name="Рис. 2. Системная диаграмма последовательности меню запросов" descr="Рис. 2. Системная диаграмма последовательности меню запросов"/>
+            <wp:extent cx="5940000" cy="6801300"/>
+            <wp:docPr id="31" name="Рис. 2. Системная диаграмма последовательности работы с запросами" descr="Рис. 2. Системная диаграмма последовательности работы с запросами"/>
             <wp:cNvGraphicFramePr>
               <a:graphicFrameLocks noChangeAspect="1"/>
             </wp:cNvGraphicFramePr>
@@ -3422,7 +3422,7 @@
               <a:graphicData uri="http://schemas.openxmlformats.org/drawingml/2006/picture">
                 <pic:pic xmlns:pic="http://schemas.openxmlformats.org/drawingml/2006/picture">
                   <pic:nvPicPr>
-                    <pic:cNvPr id="0" name="02-query-menu.png"/>
+                    <pic:cNvPr id="0" name="02-queries.png"/>
                     <pic:cNvPicPr/>
                   </pic:nvPicPr>
                   <pic:blipFill>
@@ -3434,7 +3434,7 @@
                   <pic:spPr>
                     <a:xfrm>
                       <a:off x="0" y="0"/>
-                      <a:ext cx="5400000" cy="5076000"/>
+                      <a:ext cx="5940000" cy="6801300"/>
                     </a:xfrm>
                     <a:prstGeom prst="rect">
                       <a:avLst/>
@@ -3459,7 +3459,22 @@
           <w:szCs w:val="24"/>
           <w:lang w:val="ru-RU"/>
         </w:rPr>
-        <w:t xml:space="preserve">Рис. 2. Системная диаграмма последовательности меню запросов</w:t>
+        <w:t xml:space="preserve">Рис. 2. Системная диаграмма последовательности работы с запросами</w:t>
+      </w:r>
+    </w:p>
+    <w:p>
+      <w:pPr>
+        <w:spacing w:before="0" w:after="70" w:line="264" w:lineRule="auto"/>
+        <w:jc w:val="left"/>
+      </w:pPr>
+      <w:r>
+        <w:rPr>
+          <w:rFonts w:ascii="Times New Roman" w:hAnsi="Times New Roman" w:cs="Times New Roman"/>
+          <w:sz w:val="26"/>
+          <w:szCs w:val="26"/>
+          <w:lang w:val="ru-RU"/>
+        </w:rPr>
+        <w:t xml:space="preserve">Для двух других запросов применяется та же последовательность: отправка формы, проверка параметров и отображение результата либо сообщения. Меняются параметры и столбцы таблицы.</w:t>
       </w:r>
     </w:p>
     <w:p>
@@ -3548,7 +3563,6 @@
         <w:spacing w:before="0" w:after="180" w:line="264" w:lineRule="auto"/>
         <w:jc w:val="center"/>
         <w:keepNext/>
-        <w:pageBreakBefore/>
       </w:pPr>
       <w:r>
         <w:rPr>
@@ -3558,98 +3572,7 @@
           <w:szCs w:val="32"/>
           <w:lang w:val="ru-RU"/>
         </w:rPr>
-        <w:t xml:space="preserve">2.3. Системная диаграмма выполнения запроса</w:t>
-      </w:r>
-    </w:p>
-    <w:p>
-      <w:pPr>
-        <w:jc w:val="center"/>
-        <w:keepNext/>
-        <w:spacing w:after="100" w:line="240" w:lineRule="auto"/>
-      </w:pPr>
-      <w:r>
-        <w:drawing>
-          <wp:inline distT="0" distB="0" distL="0" distR="0">
-            <wp:extent cx="5760000" cy="6854400"/>
-            <wp:docPr id="32" name="Рис. 3. Выполнение запроса «Товары выбранной категории»" descr="Рис. 3. Выполнение запроса «Товары выбранной категории»"/>
-            <wp:cNvGraphicFramePr>
-              <a:graphicFrameLocks noChangeAspect="1"/>
-            </wp:cNvGraphicFramePr>
-            <a:graphic>
-              <a:graphicData uri="http://schemas.openxmlformats.org/drawingml/2006/picture">
-                <pic:pic xmlns:pic="http://schemas.openxmlformats.org/drawingml/2006/picture">
-                  <pic:nvPicPr>
-                    <pic:cNvPr id="0" name="03-query-execution.png"/>
-                    <pic:cNvPicPr/>
-                  </pic:nvPicPr>
-                  <pic:blipFill>
-                    <a:blip r:embed="rIdLab1Figure3"/>
-                    <a:stretch>
-                      <a:fillRect/>
-                    </a:stretch>
-                  </pic:blipFill>
-                  <pic:spPr>
-                    <a:xfrm>
-                      <a:off x="0" y="0"/>
-                      <a:ext cx="5760000" cy="6854400"/>
-                    </a:xfrm>
-                    <a:prstGeom prst="rect">
-                      <a:avLst/>
-                    </a:prstGeom>
-                  </pic:spPr>
-                </pic:pic>
-              </a:graphicData>
-            </a:graphic>
-          </wp:inline>
-        </w:drawing>
-      </w:r>
-    </w:p>
-    <w:p>
-      <w:pPr>
-        <w:spacing w:before="0" w:after="130" w:line="264" w:lineRule="auto"/>
-        <w:jc w:val="center"/>
-      </w:pPr>
-      <w:r>
-        <w:rPr>
-          <w:rFonts w:ascii="Times New Roman" w:hAnsi="Times New Roman" w:cs="Times New Roman"/>
-          <w:sz w:val="24"/>
-          <w:szCs w:val="24"/>
-          <w:lang w:val="ru-RU"/>
-        </w:rPr>
-        <w:t xml:space="preserve">Рис. 3. Выполнение запроса «Товары выбранной категории»</w:t>
-      </w:r>
-    </w:p>
-    <w:p>
-      <w:pPr>
-        <w:spacing w:before="0" w:after="70" w:line="264" w:lineRule="auto"/>
-        <w:jc w:val="left"/>
-      </w:pPr>
-      <w:r>
-        <w:rPr>
-          <w:rFonts w:ascii="Times New Roman" w:hAnsi="Times New Roman" w:cs="Times New Roman"/>
-          <w:sz w:val="26"/>
-          <w:szCs w:val="26"/>
-          <w:lang w:val="ru-RU"/>
-        </w:rPr>
-        <w:t xml:space="preserve">Для двух других запросов применяется та же последовательность: отправка формы, проверка параметров и отображение результата либо сообщения. Меняются параметры и столбцы таблицы.</w:t>
-      </w:r>
-    </w:p>
-    <w:p>
-      <w:pPr>
-        <w:spacing w:before="0" w:after="180" w:line="264" w:lineRule="auto"/>
-        <w:jc w:val="center"/>
-        <w:keepNext/>
-        <w:pageBreakBefore/>
-      </w:pPr>
-      <w:r>
-        <w:rPr>
-          <w:rFonts w:ascii="Times New Roman" w:hAnsi="Times New Roman" w:cs="Times New Roman"/>
-          <w:b/>
-          <w:sz w:val="32"/>
-          <w:szCs w:val="32"/>
-          <w:lang w:val="ru-RU"/>
-        </w:rPr>
-        <w:t xml:space="preserve">2.4. Требования к формам параметров</w:t>
+        <w:t xml:space="preserve">2.3. Требования к формам параметров</w:t>
       </w:r>
     </w:p>
     <w:p>
@@ -3878,7 +3801,7 @@
           <w:szCs w:val="32"/>
           <w:lang w:val="ru-RU"/>
         </w:rPr>
-        <w:t xml:space="preserve">2.5. Общие шаблоны и вывод результатов</w:t>
+        <w:t xml:space="preserve">2.4. Общие шаблоны и вывод результатов</w:t>
       </w:r>
     </w:p>
     <w:p>

</xml_diff>